<commit_message>
style(catedra): apply strict APA 7, Times New Roman 12pt and clean justification to Protocolo Individual 4.docx
</commit_message>
<xml_diff>
--- a/Cátedra Institucional/Entregables/Protocolo Individual 4.docx
+++ b/Cátedra Institucional/Entregables/Protocolo Individual 4.docx
@@ -122,17 +122,30 @@
                 <w:highlight w:val="none"/>
               </w:rPr>
             </w:pPr>
-            <w:r/>
+            <w:r>
+              <w:rPr>
+                <w:rFonts w:ascii="Times New Roman" w:hAnsi="Times New Roman"/>
+                <w:i w:val="0"/>
+                <w:sz w:val="24"/>
+              </w:rPr>
+            </w:r>
             <w:bookmarkStart w:id="0" w:name="_heading=h.gjdgxs"/>
-            <w:r/>
+            <w:r>
+              <w:rPr>
+                <w:rFonts w:ascii="Times New Roman" w:hAnsi="Times New Roman"/>
+                <w:i w:val="0"/>
+                <w:sz w:val="24"/>
+              </w:rPr>
+            </w:r>
             <w:bookmarkEnd w:id="0"/>
             <w:r>
               <w:rPr>
-                <w:rFonts w:ascii="Arial" w:hAnsi="Arial" w:eastAsia="Arial" w:cs="Arial"/>
+                <w:rFonts w:ascii="Times New Roman" w:hAnsi="Times New Roman" w:eastAsia="Arial" w:cs="Arial"/>
                 <w:b/>
                 <w:bCs/>
+                <w:i w:val="0"/>
                 <w:color w:val="000000" w:themeColor="text1"/>
-                <w:sz w:val="28"/>
+                <w:sz w:val="24"/>
                 <w:szCs w:val="28"/>
                 <w:rtl w:val="0"/>
               </w:rPr>
@@ -140,22 +153,24 @@
             </w:r>
             <w:r>
               <w:rPr>
-                <w:rFonts w:ascii="Arial" w:hAnsi="Arial" w:eastAsia="Arial" w:cs="Arial"/>
+                <w:rFonts w:ascii="Times New Roman" w:hAnsi="Times New Roman" w:eastAsia="Arial" w:cs="Arial"/>
                 <w:b/>
                 <w:bCs/>
+                <w:i w:val="0"/>
                 <w:color w:val="000000" w:themeColor="text1"/>
-                <w:sz w:val="28"/>
+                <w:sz w:val="24"/>
                 <w:szCs w:val="28"/>
                 <w:highlight w:val="none"/>
               </w:rPr>
             </w:r>
             <w:r>
               <w:rPr>
-                <w:rFonts w:ascii="Arial" w:hAnsi="Arial" w:eastAsia="Arial" w:cs="Arial"/>
+                <w:rFonts w:ascii="Times New Roman" w:hAnsi="Times New Roman" w:eastAsia="Arial" w:cs="Arial"/>
                 <w:b/>
                 <w:bCs/>
+                <w:i w:val="0"/>
                 <w:color w:val="000000" w:themeColor="text1"/>
-                <w:sz w:val="28"/>
+                <w:sz w:val="24"/>
                 <w:szCs w:val="28"/>
                 <w:highlight w:val="none"/>
               </w:rPr>
@@ -179,11 +194,12 @@
             </w:pPr>
             <w:r>
               <w:rPr>
-                <w:rFonts w:ascii="Arial" w:hAnsi="Arial" w:eastAsia="Arial" w:cs="Arial"/>
+                <w:rFonts w:ascii="Times New Roman" w:hAnsi="Times New Roman" w:eastAsia="Arial" w:cs="Arial"/>
                 <w:b/>
                 <w:bCs/>
+                <w:i w:val="0"/>
                 <w:color w:val="000000" w:themeColor="text1"/>
-                <w:sz w:val="28"/>
+                <w:sz w:val="24"/>
                 <w:szCs w:val="28"/>
                 <w:highlight w:val="none"/>
                 <w:rtl w:val="0"/>
@@ -193,11 +209,12 @@
             </w:r>
             <w:r>
               <w:rPr>
-                <w:rFonts w:ascii="Arial" w:hAnsi="Arial" w:eastAsia="Arial" w:cs="Arial"/>
+                <w:rFonts w:ascii="Times New Roman" w:hAnsi="Times New Roman" w:eastAsia="Arial" w:cs="Arial"/>
                 <w:b w:val="0"/>
                 <w:bCs w:val="0"/>
+                <w:i w:val="0"/>
                 <w:color w:val="000000" w:themeColor="text1"/>
-                <w:sz w:val="28"/>
+                <w:sz w:val="24"/>
                 <w:szCs w:val="28"/>
                 <w:highlight w:val="none"/>
                 <w:rtl w:val="0"/>
@@ -207,11 +224,12 @@
             </w:r>
             <w:r>
               <w:rPr>
-                <w:rFonts w:ascii="Arial" w:hAnsi="Arial" w:eastAsia="Arial" w:cs="Arial"/>
+                <w:rFonts w:ascii="Times New Roman" w:hAnsi="Times New Roman" w:eastAsia="Arial" w:cs="Arial"/>
                 <w:b w:val="0"/>
                 <w:bCs w:val="0"/>
+                <w:i w:val="0"/>
                 <w:color w:val="000000" w:themeColor="text1"/>
-                <w:sz w:val="28"/>
+                <w:sz w:val="24"/>
                 <w:szCs w:val="28"/>
                 <w:highlight w:val="none"/>
                 <w:lang w:val="es-ES"/>
@@ -219,11 +237,12 @@
             </w:r>
             <w:r>
               <w:rPr>
-                <w:rFonts w:ascii="Arial" w:hAnsi="Arial" w:eastAsia="Arial" w:cs="Arial"/>
+                <w:rFonts w:ascii="Times New Roman" w:hAnsi="Times New Roman" w:eastAsia="Arial" w:cs="Arial"/>
                 <w:b w:val="0"/>
                 <w:bCs w:val="0"/>
+                <w:i w:val="0"/>
                 <w:color w:val="000000" w:themeColor="text1"/>
-                <w:sz w:val="28"/>
+                <w:sz w:val="24"/>
                 <w:szCs w:val="28"/>
                 <w:highlight w:val="none"/>
               </w:rPr>
@@ -247,11 +266,12 @@
             </w:pPr>
             <w:r>
               <w:rPr>
-                <w:rFonts w:ascii="Arial" w:hAnsi="Arial" w:eastAsia="Arial" w:cs="Arial"/>
+                <w:rFonts w:ascii="Times New Roman" w:hAnsi="Times New Roman" w:eastAsia="Arial" w:cs="Arial"/>
                 <w:b/>
                 <w:bCs/>
+                <w:i w:val="0"/>
                 <w:color w:val="000000" w:themeColor="text1"/>
-                <w:sz w:val="28"/>
+                <w:sz w:val="24"/>
                 <w:szCs w:val="28"/>
                 <w:highlight w:val="none"/>
                 <w:rtl w:val="0"/>
@@ -261,11 +281,12 @@
             </w:r>
             <w:r>
               <w:rPr>
-                <w:rFonts w:ascii="Arial" w:hAnsi="Arial" w:eastAsia="Arial" w:cs="Arial"/>
+                <w:rFonts w:ascii="Times New Roman" w:hAnsi="Times New Roman" w:eastAsia="Arial" w:cs="Arial"/>
                 <w:b w:val="0"/>
                 <w:bCs w:val="0"/>
+                <w:i w:val="0"/>
                 <w:color w:val="000000" w:themeColor="text1"/>
-                <w:sz w:val="28"/>
+                <w:sz w:val="24"/>
                 <w:szCs w:val="28"/>
                 <w:highlight w:val="none"/>
                 <w:rtl w:val="0"/>
@@ -276,11 +297,12 @@
             </w:r>
             <w:r>
               <w:rPr>
-                <w:rFonts w:ascii="Arial" w:hAnsi="Arial" w:eastAsia="Arial" w:cs="Arial"/>
+                <w:rFonts w:ascii="Times New Roman" w:hAnsi="Times New Roman" w:eastAsia="Arial" w:cs="Arial"/>
                 <w:b/>
                 <w:bCs/>
+                <w:i w:val="0"/>
                 <w:color w:val="000000" w:themeColor="text1"/>
-                <w:sz w:val="28"/>
+                <w:sz w:val="24"/>
                 <w:szCs w:val="28"/>
                 <w:highlight w:val="none"/>
                 <w:rtl w:val="0"/>
@@ -290,11 +312,12 @@
             </w:r>
             <w:r>
               <w:rPr>
-                <w:rFonts w:ascii="Arial" w:hAnsi="Arial" w:eastAsia="Arial" w:cs="Arial"/>
+                <w:rFonts w:ascii="Times New Roman" w:hAnsi="Times New Roman" w:eastAsia="Arial" w:cs="Arial"/>
                 <w:b w:val="0"/>
                 <w:bCs w:val="0"/>
+                <w:i w:val="0"/>
                 <w:color w:val="000000" w:themeColor="text1"/>
-                <w:sz w:val="28"/>
+                <w:sz w:val="24"/>
                 <w:szCs w:val="28"/>
                 <w:highlight w:val="none"/>
                 <w:rtl w:val="0"/>
@@ -304,11 +327,12 @@
             </w:r>
             <w:r>
               <w:rPr>
-                <w:rFonts w:ascii="Arial" w:hAnsi="Arial" w:eastAsia="Arial" w:cs="Arial"/>
+                <w:rFonts w:ascii="Times New Roman" w:hAnsi="Times New Roman" w:eastAsia="Arial" w:cs="Arial"/>
                 <w:b w:val="0"/>
                 <w:bCs w:val="0"/>
+                <w:i w:val="0"/>
                 <w:color w:val="000000" w:themeColor="text1"/>
-                <w:sz w:val="28"/>
+                <w:sz w:val="24"/>
                 <w:szCs w:val="28"/>
                 <w:highlight w:val="none"/>
                 <w:lang w:val="es-ES"/>
@@ -316,11 +340,12 @@
             </w:r>
             <w:r>
               <w:rPr>
-                <w:rFonts w:ascii="Arial" w:hAnsi="Arial" w:eastAsia="Arial" w:cs="Arial"/>
+                <w:rFonts w:ascii="Times New Roman" w:hAnsi="Times New Roman" w:eastAsia="Arial" w:cs="Arial"/>
                 <w:b w:val="0"/>
                 <w:bCs w:val="0"/>
+                <w:i w:val="0"/>
                 <w:color w:val="000000" w:themeColor="text1"/>
-                <w:sz w:val="28"/>
+                <w:sz w:val="24"/>
                 <w:szCs w:val="28"/>
                 <w:highlight w:val="none"/>
               </w:rPr>
@@ -343,11 +368,12 @@
             </w:pPr>
             <w:r>
               <w:rPr>
-                <w:rFonts w:ascii="Arial" w:hAnsi="Arial" w:eastAsia="Arial" w:cs="Arial"/>
+                <w:rFonts w:ascii="Times New Roman" w:hAnsi="Times New Roman" w:eastAsia="Arial" w:cs="Arial"/>
                 <w:b/>
                 <w:bCs/>
+                <w:i w:val="0"/>
                 <w:color w:val="000000" w:themeColor="text1"/>
-                <w:sz w:val="28"/>
+                <w:sz w:val="24"/>
                 <w:szCs w:val="28"/>
                 <w:highlight w:val="none"/>
                 <w:rtl w:val="0"/>
@@ -357,11 +383,12 @@
             </w:r>
             <w:r>
               <w:rPr>
-                <w:rFonts w:ascii="Arial" w:hAnsi="Arial" w:eastAsia="Arial" w:cs="Arial"/>
+                <w:rFonts w:ascii="Times New Roman" w:hAnsi="Times New Roman" w:eastAsia="Arial" w:cs="Arial"/>
                 <w:b w:val="0"/>
                 <w:bCs w:val="0"/>
+                <w:i w:val="0"/>
                 <w:color w:val="000000" w:themeColor="text1"/>
-                <w:sz w:val="28"/>
+                <w:sz w:val="24"/>
                 <w:szCs w:val="28"/>
                 <w:highlight w:val="none"/>
                 <w:rtl w:val="0"/>
@@ -371,21 +398,23 @@
             </w:r>
             <w:r>
               <w:rPr>
-                <w:rFonts w:ascii="Arial" w:hAnsi="Arial" w:eastAsia="Arial" w:cs="Arial"/>
+                <w:rFonts w:ascii="Times New Roman" w:hAnsi="Times New Roman" w:eastAsia="Arial" w:cs="Arial"/>
                 <w:b w:val="0"/>
                 <w:bCs w:val="0"/>
+                <w:i w:val="0"/>
                 <w:color w:val="000000" w:themeColor="text1"/>
-                <w:sz w:val="28"/>
+                <w:sz w:val="24"/>
                 <w:szCs w:val="28"/>
               </w:rPr>
             </w:r>
             <w:r>
               <w:rPr>
-                <w:rFonts w:ascii="Arial" w:hAnsi="Arial" w:eastAsia="Arial" w:cs="Arial"/>
+                <w:rFonts w:ascii="Times New Roman" w:hAnsi="Times New Roman" w:eastAsia="Arial" w:cs="Arial"/>
                 <w:b w:val="0"/>
                 <w:bCs w:val="0"/>
+                <w:i w:val="0"/>
                 <w:color w:val="000000" w:themeColor="text1"/>
-                <w:sz w:val="28"/>
+                <w:sz w:val="24"/>
                 <w:szCs w:val="28"/>
               </w:rPr>
             </w:r>
@@ -403,42 +432,25 @@
           <w:p>
             <w:pPr>
               <w:pBdr/>
-              <w:spacing w:line="360" w:lineRule="auto"/>
+              <w:spacing w:line="360" w:lineRule="auto" w:after="80"/>
               <w:ind/>
-              <w:jc w:val="both"/>
+              <w:jc w:val="left"/>
               <w:rPr/>
             </w:pPr>
             <w:r>
               <w:rPr>
-                <w:rFonts w:ascii="Arial" w:hAnsi="Arial" w:eastAsia="Arial" w:cs="Arial"/>
+                <w:rFonts w:ascii="Times New Roman" w:hAnsi="Times New Roman"/>
                 <w:b/>
-                <w:bCs/>
-                <w:rtl w:val="0"/>
+                <w:i w:val="0"/>
+                <w:sz w:val="24"/>
               </w:rPr>
-              <w:t xml:space="preserve">Descripción del texto o actividad a realizar</w:t>
+              <w:t>Descripción del texto o actividad a realizar:</w:t>
             </w:r>
-            <w:r>
-              <w:rPr>
-                <w:rFonts w:ascii="Arial" w:hAnsi="Arial" w:eastAsia="Arial" w:cs="Arial"/>
-                <w:b/>
-                <w:bCs/>
-                <w:rtl w:val="0"/>
-                <w:lang w:val="es-ES"/>
-              </w:rPr>
-              <w:t xml:space="preserve">:</w:t>
-            </w:r>
-            <w:r>
-              <w:rPr>
-                <w:rFonts w:ascii="Arial" w:hAnsi="Arial" w:eastAsia="Arial" w:cs="Arial"/>
-                <w:rtl w:val="0"/>
-                <w:lang w:val="es-ES"/>
-              </w:rPr>
-            </w:r>
-            <w:r/>
           </w:p>
           <w:p>
             <w:pPr>
               <w:spacing w:after="120" w:line="276" w:lineRule="auto"/>
+              <w:jc w:val="both"/>
             </w:pPr>
             <w:r>
               <w:rPr>
@@ -463,42 +475,25 @@
           <w:p>
             <w:pPr>
               <w:pBdr/>
-              <w:spacing w:line="360" w:lineRule="auto"/>
+              <w:spacing w:line="360" w:lineRule="auto" w:after="80"/>
               <w:ind/>
-              <w:jc w:val="both"/>
+              <w:jc w:val="left"/>
               <w:rPr/>
             </w:pPr>
             <w:r>
               <w:rPr>
-                <w:rFonts w:ascii="Arial" w:hAnsi="Arial" w:eastAsia="Arial" w:cs="Arial"/>
+                <w:rFonts w:ascii="Times New Roman" w:hAnsi="Times New Roman"/>
                 <w:b/>
-                <w:bCs/>
-                <w:rtl w:val="0"/>
+                <w:i w:val="0"/>
+                <w:sz w:val="24"/>
               </w:rPr>
-              <w:t xml:space="preserve">Palabras claves</w:t>
+              <w:t>Palabras claves:</w:t>
             </w:r>
-            <w:r>
-              <w:rPr>
-                <w:rFonts w:ascii="Arial" w:hAnsi="Arial" w:eastAsia="Arial" w:cs="Arial"/>
-                <w:b/>
-                <w:bCs/>
-                <w:rtl w:val="0"/>
-                <w:lang w:val="es-ES"/>
-              </w:rPr>
-              <w:t xml:space="preserve">:</w:t>
-            </w:r>
-            <w:r>
-              <w:rPr>
-                <w:rFonts w:ascii="Arial" w:hAnsi="Arial" w:eastAsia="Arial" w:cs="Arial"/>
-                <w:rtl w:val="0"/>
-                <w:lang w:val="es-ES"/>
-              </w:rPr>
-            </w:r>
-            <w:r/>
           </w:p>
           <w:p>
             <w:pPr>
               <w:spacing w:after="120" w:line="276" w:lineRule="auto"/>
+              <w:jc w:val="both"/>
             </w:pPr>
             <w:r>
               <w:rPr>
@@ -523,9 +518,9 @@
           <w:p>
             <w:pPr>
               <w:pBdr/>
-              <w:spacing w:line="360" w:lineRule="auto"/>
+              <w:spacing w:line="360" w:lineRule="auto" w:after="80"/>
               <w:ind/>
-              <w:jc w:val="both"/>
+              <w:jc w:val="left"/>
               <w:rPr>
                 <w:b w:val="0"/>
                 <w:bCs w:val="0"/>
@@ -533,33 +528,18 @@
             </w:pPr>
             <w:r>
               <w:rPr>
-                <w:rFonts w:ascii="Arial" w:hAnsi="Arial" w:eastAsia="Arial" w:cs="Arial"/>
+                <w:rFonts w:ascii="Times New Roman" w:hAnsi="Times New Roman"/>
                 <w:b/>
-                <w:bCs/>
-                <w:rtl w:val="0"/>
+                <w:i w:val="0"/>
+                <w:sz w:val="24"/>
               </w:rPr>
-              <w:t xml:space="preserve">Objetivos de las lecturas o actividad a realizar</w:t>
-            </w:r>
-            <w:r>
-              <w:rPr>
-                <w:rFonts w:ascii="Arial" w:hAnsi="Arial" w:eastAsia="Arial" w:cs="Arial"/>
-                <w:b/>
-                <w:bCs/>
-                <w:rtl w:val="0"/>
-                <w:lang w:val="es-ES"/>
-              </w:rPr>
-              <w:t xml:space="preserve">:</w:t>
-            </w:r>
-            <w:r>
-              <w:rPr>
-                <w:b w:val="0"/>
-                <w:bCs w:val="0"/>
-              </w:rPr>
+              <w:t>Objetivos de las lecturas o actividad a realizar:</w:t>
             </w:r>
           </w:p>
           <w:p>
             <w:pPr>
               <w:spacing w:after="120" w:line="276" w:lineRule="auto"/>
+              <w:jc w:val="both"/>
             </w:pPr>
             <w:r>
               <w:rPr>
@@ -568,12 +548,13 @@
                 <w:i w:val="0"/>
                 <w:sz w:val="24"/>
               </w:rPr>
-              <w:t>Diferenciar qué es un impulso, un instinto, una necesidad y un motivo según la psicología moderna.</w:t>
+              <w:t>1. Diferenciar qué es un impulso, un instinto, una necesidad y un motivo según la psicología moderna.</w:t>
             </w:r>
           </w:p>
           <w:p>
             <w:pPr>
               <w:spacing w:after="120" w:line="276" w:lineRule="auto"/>
+              <w:jc w:val="both"/>
             </w:pPr>
             <w:r>
               <w:rPr>
@@ -582,12 +563,13 @@
                 <w:i w:val="0"/>
                 <w:sz w:val="24"/>
               </w:rPr>
-              <w:t>Entender los cinco niveles de la pirámide de Maslow y ver cómo influye el cuidado de las necesidades básicas en el rendimiento académico.</w:t>
+              <w:t>2. Entender los cinco niveles de la pirámide de Maslow y ver cómo influye el cuidado de las necesidades básicas en el rendimiento académico.</w:t>
             </w:r>
           </w:p>
           <w:p>
             <w:pPr>
               <w:spacing w:after="120" w:line="276" w:lineRule="auto"/>
+              <w:jc w:val="both"/>
             </w:pPr>
             <w:r>
               <w:rPr>
@@ -596,12 +578,13 @@
                 <w:i w:val="0"/>
                 <w:sz w:val="24"/>
               </w:rPr>
-              <w:t>Analizar cómo los valores éticos ayudan a resolver necesidades personales y sociales de forma constructiva.</w:t>
+              <w:t>3. Analizar cómo los valores éticos ayudan a resolver necesidades personales y sociales de forma constructiva.</w:t>
             </w:r>
           </w:p>
           <w:p>
             <w:pPr>
               <w:spacing w:after="120" w:line="276" w:lineRule="auto"/>
+              <w:jc w:val="both"/>
             </w:pPr>
             <w:r>
               <w:rPr>
@@ -610,7 +593,7 @@
                 <w:i w:val="0"/>
                 <w:sz w:val="24"/>
               </w:rPr>
-              <w:t>Reflexionar sobre el sentido práctico de la autonomía en la educación a distancia para evitar la postergación de tareas.</w:t>
+              <w:t>4. Reflexionar sobre el sentido práctico de la autonomía en la educación a distancia para evitar la postergación de tareas.</w:t>
             </w:r>
           </w:p>
         </w:tc>
@@ -626,7 +609,7 @@
           <w:p>
             <w:pPr>
               <w:pBdr/>
-              <w:spacing w:line="360" w:lineRule="auto"/>
+              <w:spacing w:line="360" w:lineRule="auto" w:after="80"/>
               <w:ind/>
               <w:jc w:val="left"/>
               <w:rPr/>
@@ -643,7 +626,8 @@
           </w:p>
           <w:p>
             <w:pPr>
-              <w:spacing w:after="120" w:line="276" w:lineRule="auto"/>
+              <w:spacing w:after="80" w:line="276" w:lineRule="auto"/>
+              <w:jc w:val="both"/>
             </w:pPr>
             <w:r>
               <w:rPr>
@@ -666,7 +650,8 @@
           </w:p>
           <w:p>
             <w:pPr>
-              <w:spacing w:after="120" w:line="276" w:lineRule="auto"/>
+              <w:spacing w:after="80" w:line="276" w:lineRule="auto"/>
+              <w:jc w:val="both"/>
             </w:pPr>
             <w:r>
               <w:rPr>
@@ -689,7 +674,8 @@
           </w:p>
           <w:p>
             <w:pPr>
-              <w:spacing w:after="120" w:line="276" w:lineRule="auto"/>
+              <w:spacing w:after="80" w:line="276" w:lineRule="auto"/>
+              <w:jc w:val="both"/>
             </w:pPr>
             <w:r>
               <w:rPr>
@@ -712,7 +698,8 @@
           </w:p>
           <w:p>
             <w:pPr>
-              <w:spacing w:after="120" w:line="276" w:lineRule="auto"/>
+              <w:spacing w:after="80" w:line="276" w:lineRule="auto"/>
+              <w:jc w:val="both"/>
             </w:pPr>
             <w:r>
               <w:rPr>
@@ -735,7 +722,8 @@
           </w:p>
           <w:p>
             <w:pPr>
-              <w:spacing w:after="120" w:line="276" w:lineRule="auto"/>
+              <w:spacing w:after="80" w:line="276" w:lineRule="auto"/>
+              <w:jc w:val="both"/>
             </w:pPr>
             <w:r>
               <w:rPr>
@@ -758,7 +746,8 @@
           </w:p>
           <w:p>
             <w:pPr>
-              <w:spacing w:after="120" w:line="276" w:lineRule="auto"/>
+              <w:spacing w:after="80" w:line="276" w:lineRule="auto"/>
+              <w:jc w:val="both"/>
             </w:pPr>
             <w:r>
               <w:rPr>
@@ -781,7 +770,8 @@
           </w:p>
           <w:p>
             <w:pPr>
-              <w:spacing w:after="120" w:line="276" w:lineRule="auto"/>
+              <w:spacing w:after="80" w:line="276" w:lineRule="auto"/>
+              <w:jc w:val="both"/>
             </w:pPr>
             <w:r>
               <w:rPr>
@@ -816,35 +806,25 @@
           <w:p>
             <w:pPr>
               <w:pBdr/>
-              <w:spacing w:line="360" w:lineRule="auto"/>
+              <w:spacing w:line="360" w:lineRule="auto" w:after="80"/>
               <w:ind/>
-              <w:jc w:val="both"/>
+              <w:jc w:val="left"/>
               <w:rPr/>
             </w:pPr>
             <w:r>
               <w:rPr>
-                <w:rFonts w:ascii="Arial" w:hAnsi="Arial" w:eastAsia="Arial" w:cs="Arial"/>
+                <w:rFonts w:ascii="Times New Roman" w:hAnsi="Times New Roman"/>
                 <w:b/>
-                <w:bCs/>
-                <w:rtl w:val="0"/>
+                <w:i w:val="0"/>
+                <w:sz w:val="24"/>
               </w:rPr>
-              <w:t xml:space="preserve">Resumen de la(as) lecturas</w:t>
+              <w:t>Resumen de la(as) lecturas:</w:t>
             </w:r>
-            <w:r>
-              <w:rPr>
-                <w:rFonts w:ascii="Arial" w:hAnsi="Arial" w:eastAsia="Arial" w:cs="Arial"/>
-                <w:b/>
-                <w:bCs/>
-                <w:rtl w:val="0"/>
-                <w:lang w:val="es-ES"/>
-              </w:rPr>
-              <w:t xml:space="preserve">:</w:t>
-            </w:r>
-            <w:r/>
           </w:p>
           <w:p>
             <w:pPr>
               <w:spacing w:after="120" w:line="276" w:lineRule="auto"/>
+              <w:jc w:val="both"/>
             </w:pPr>
             <w:r>
               <w:rPr>
@@ -859,6 +839,7 @@
           <w:p>
             <w:pPr>
               <w:spacing w:after="120" w:line="276" w:lineRule="auto"/>
+              <w:jc w:val="both"/>
             </w:pPr>
             <w:r>
               <w:rPr>
@@ -873,6 +854,7 @@
           <w:p>
             <w:pPr>
               <w:spacing w:after="120" w:line="276" w:lineRule="auto"/>
+              <w:jc w:val="both"/>
             </w:pPr>
             <w:r>
               <w:rPr>
@@ -887,6 +869,7 @@
           <w:p>
             <w:pPr>
               <w:spacing w:after="120" w:line="276" w:lineRule="auto"/>
+              <w:jc w:val="both"/>
             </w:pPr>
             <w:r>
               <w:rPr>
@@ -897,13 +880,13 @@
               </w:rPr>
               <w:t>Finalmente, el módulo aterriza estos principios en el modelo de educación superior a distancia. Señala que este sistema requiere estudiantes activos y destaca cuatro valores formativos:</w:t>
               <w:br/>
-              <w:t>1. Autonomía: Darse horarios de estudio propios y asumir con madurez las decisiones académicas sin requerir supervisión ajena.</w:t>
+              <w:t>• Autonomía: Darse horarios de estudio propios y asumir con madurez las decisiones académicas sin requerir supervisión ajena.</w:t>
               <w:br/>
-              <w:t>2. Solidaridad: Apoyar a compañeros con limitaciones de tiempo o conectividad, buscando el progreso colectivo.</w:t>
+              <w:t>• Solidaridad: Apoyar a compañeros con limitaciones de tiempo o conectividad, buscando el progreso colectivo.</w:t>
               <w:br/>
-              <w:t>3. Diálogo: Mantener una comunicación fluida y sincera para contrarrestar el aislamiento propio del entorno virtual.</w:t>
+              <w:t>• Diálogo: Mantener una comunicación fluida y sincera para contrarrestar el aislamiento propio del entorno virtual.</w:t>
               <w:br/>
-              <w:t>4. Tolerancia: Comprender y valorar los distintos puntos de vista y ritmos de aprendizaje en el equipo.</w:t>
+              <w:t>• Tolerancia: Comprender y valorar los distintos puntos de vista y ritmos de aprendizaje en el equipo.</w:t>
             </w:r>
           </w:p>
         </w:tc>
@@ -920,9 +903,9 @@
           <w:p>
             <w:pPr>
               <w:pBdr/>
-              <w:spacing w:line="360" w:lineRule="auto"/>
+              <w:spacing w:line="360" w:lineRule="auto" w:after="80"/>
               <w:ind/>
-              <w:jc w:val="both"/>
+              <w:jc w:val="left"/>
               <w:rPr>
                 <w:b w:val="0"/>
                 <w:bCs w:val="0"/>
@@ -941,6 +924,7 @@
           <w:p>
             <w:pPr>
               <w:spacing w:after="120" w:line="276" w:lineRule="auto"/>
+              <w:jc w:val="both"/>
             </w:pPr>
             <w:r>
               <w:rPr>
@@ -965,33 +949,25 @@
           <w:p>
             <w:pPr>
               <w:pBdr/>
-              <w:spacing w:line="360" w:lineRule="auto"/>
+              <w:spacing w:line="360" w:lineRule="auto" w:after="80"/>
               <w:ind/>
-              <w:jc w:val="both"/>
+              <w:jc w:val="left"/>
               <w:rPr/>
             </w:pPr>
             <w:r>
               <w:rPr>
-                <w:rFonts w:ascii="Arial" w:hAnsi="Arial" w:eastAsia="Arial" w:cs="Arial"/>
+                <w:rFonts w:ascii="Times New Roman" w:hAnsi="Times New Roman"/>
                 <w:b/>
-                <w:bCs/>
-                <w:rtl w:val="0"/>
+                <w:i w:val="0"/>
+                <w:sz w:val="24"/>
               </w:rPr>
-              <w:t xml:space="preserve">Conclusiones de la lectura o actividad</w:t>
+              <w:t>Conclusiones de la lectura o actividad:</w:t>
             </w:r>
-            <w:r>
-              <w:rPr>
-                <w:rFonts w:ascii="Arial" w:hAnsi="Arial" w:eastAsia="Arial" w:cs="Arial"/>
-                <w:rtl w:val="0"/>
-                <w:lang w:val="es-ES"/>
-              </w:rPr>
-              <w:t xml:space="preserve">:</w:t>
-            </w:r>
-            <w:r/>
           </w:p>
           <w:p>
             <w:pPr>
               <w:spacing w:after="120" w:line="276" w:lineRule="auto"/>
+              <w:jc w:val="both"/>
             </w:pPr>
             <w:r>
               <w:rPr>
@@ -1000,12 +976,13 @@
                 <w:i w:val="0"/>
                 <w:sz w:val="24"/>
               </w:rPr>
-              <w:t>La motivación real se sostiene con disciplina diaria, metas específicas y hábitos estables, no con arranques emocionales pasajeros.</w:t>
+              <w:t>• La motivación real se sostiene con disciplina diaria, metas específicas y hábitos estables, no con arranques emocionales pasajeros.</w:t>
             </w:r>
           </w:p>
           <w:p>
             <w:pPr>
               <w:spacing w:after="120" w:line="276" w:lineRule="auto"/>
+              <w:jc w:val="both"/>
             </w:pPr>
             <w:r>
               <w:rPr>
@@ -1014,12 +991,13 @@
                 <w:i w:val="0"/>
                 <w:sz w:val="24"/>
               </w:rPr>
-              <w:t>La pirámide de Maslow confirma que el descanso es una condición técnica para estudiar. Cuando descuido las horas de sueño, mi capacidad de razonamiento abstracto se cae por completo.</w:t>
+              <w:t>• La pirámide de Maslow confirma que el descanso es una condición técnica para estudiar. Cuando descuido las horas de sueño, mi capacidad de razonamiento abstracto se cae por completo.</w:t>
             </w:r>
           </w:p>
           <w:p>
             <w:pPr>
               <w:spacing w:after="120" w:line="276" w:lineRule="auto"/>
+              <w:jc w:val="both"/>
             </w:pPr>
             <w:r>
               <w:rPr>
@@ -1028,7 +1006,7 @@
                 <w:i w:val="0"/>
                 <w:sz w:val="24"/>
               </w:rPr>
-              <w:t>La autonomía es el eje de la educación a distancia. Nadie va a vigilar si leo o no los módulos; mi avance en la carrera depende exclusivamente de las normas que yo mismo decida cumplir.</w:t>
+              <w:t>• La autonomía es el eje de la educación a distancia. Nadie va a vigilar si leo o no los módulos; mi avance en la carrera depende exclusivamente de las normas que yo mismo decida cumplir.</w:t>
             </w:r>
           </w:p>
         </w:tc>
@@ -1044,9 +1022,9 @@
           <w:p>
             <w:pPr>
               <w:pBdr/>
-              <w:spacing w:line="360" w:lineRule="auto"/>
+              <w:spacing w:line="360" w:lineRule="auto" w:after="80"/>
               <w:ind/>
-              <w:jc w:val="both"/>
+              <w:jc w:val="left"/>
               <w:rPr>
                 <w:b w:val="0"/>
                 <w:bCs w:val="0"/>
@@ -1054,39 +1032,18 @@
             </w:pPr>
             <w:r>
               <w:rPr>
-                <w:rFonts w:ascii="Arial" w:hAnsi="Arial" w:eastAsia="Arial" w:cs="Arial"/>
+                <w:rFonts w:ascii="Times New Roman" w:hAnsi="Times New Roman"/>
                 <w:b/>
-                <w:bCs/>
-                <w:rtl w:val="0"/>
+                <w:i w:val="0"/>
+                <w:sz w:val="24"/>
               </w:rPr>
-              <w:t xml:space="preserve">Discusiones y recomendaciones</w:t>
-            </w:r>
-            <w:r>
-              <w:rPr>
-                <w:rFonts w:ascii="Arial" w:hAnsi="Arial" w:eastAsia="Arial" w:cs="Arial"/>
-                <w:b/>
-                <w:bCs/>
-                <w:rtl w:val="0"/>
-                <w:lang w:val="es-ES"/>
-              </w:rPr>
-              <w:t xml:space="preserve">:</w:t>
-            </w:r>
-            <w:r>
-              <w:rPr>
-                <w:b w:val="0"/>
-                <w:bCs w:val="0"/>
-              </w:rPr>
-            </w:r>
-            <w:r>
-              <w:rPr>
-                <w:b w:val="0"/>
-                <w:bCs w:val="0"/>
-              </w:rPr>
+              <w:t>Discusiones y recomendaciones:</w:t>
             </w:r>
           </w:p>
           <w:p>
             <w:pPr>
               <w:spacing w:after="120" w:line="276" w:lineRule="auto"/>
+              <w:jc w:val="both"/>
             </w:pPr>
             <w:r>
               <w:rPr>
@@ -1101,6 +1058,7 @@
           <w:p>
             <w:pPr>
               <w:spacing w:after="120" w:line="276" w:lineRule="auto"/>
+              <w:jc w:val="both"/>
             </w:pPr>
             <w:r>
               <w:rPr>
@@ -1125,9 +1083,9 @@
           <w:p>
             <w:pPr>
               <w:pBdr/>
-              <w:spacing w:line="360" w:lineRule="auto"/>
+              <w:spacing w:line="360" w:lineRule="auto" w:after="80"/>
               <w:ind/>
-              <w:jc w:val="both"/>
+              <w:jc w:val="left"/>
               <w:rPr>
                 <w:b w:val="0"/>
                 <w:bCs w:val="0"/>
@@ -1135,38 +1093,23 @@
             </w:pPr>
             <w:r>
               <w:rPr>
-                <w:rFonts w:ascii="Arial" w:hAnsi="Arial" w:eastAsia="Arial" w:cs="Arial"/>
+                <w:rFonts w:ascii="Times New Roman" w:hAnsi="Times New Roman"/>
                 <w:b/>
-                <w:bCs/>
-                <w:rtl w:val="0"/>
+                <w:i w:val="0"/>
+                <w:sz w:val="24"/>
               </w:rPr>
-              <w:t xml:space="preserve">Bibliografía</w:t>
-            </w:r>
-            <w:r>
-              <w:rPr>
-                <w:rFonts w:ascii="Arial" w:hAnsi="Arial" w:eastAsia="Arial" w:cs="Arial"/>
-                <w:b/>
-                <w:bCs/>
-                <w:rtl w:val="0"/>
-                <w:lang w:val="es-ES"/>
-              </w:rPr>
-              <w:t xml:space="preserve">:</w:t>
-            </w:r>
-            <w:r>
-              <w:rPr>
-                <w:b w:val="0"/>
-                <w:bCs w:val="0"/>
-              </w:rPr>
+              <w:t>Bibliografía:</w:t>
             </w:r>
           </w:p>
           <w:p>
             <w:pPr>
               <w:spacing w:after="120" w:line="276" w:lineRule="auto"/>
+              <w:jc w:val="left"/>
             </w:pPr>
             <w:r>
               <w:rPr>
                 <w:rFonts w:ascii="Times New Roman" w:hAnsi="Times New Roman"/>
-                <w:b/>
+                <w:b w:val="0"/>
                 <w:i w:val="0"/>
                 <w:sz w:val="24"/>
               </w:rPr>
@@ -1179,17 +1122,36 @@
                 <w:i w:val="0"/>
                 <w:sz w:val="24"/>
               </w:rPr>
-              <w:t>(2015). Psicología empresarial y comunicación (pp. 163-180). Ediciones de la U.</w:t>
+              <w:t xml:space="preserve">(2015). </w:t>
+            </w:r>
+            <w:r>
+              <w:rPr>
+                <w:rFonts w:ascii="Times New Roman" w:hAnsi="Times New Roman"/>
+                <w:b w:val="0"/>
+                <w:i/>
+                <w:sz w:val="24"/>
+              </w:rPr>
+              <w:t xml:space="preserve">Psicología empresarial y comunicación </w:t>
+            </w:r>
+            <w:r>
+              <w:rPr>
+                <w:rFonts w:ascii="Times New Roman" w:hAnsi="Times New Roman"/>
+                <w:b w:val="0"/>
+                <w:i w:val="0"/>
+                <w:sz w:val="24"/>
+              </w:rPr>
+              <w:t>(pp. 163-180). Ediciones de la U.</w:t>
             </w:r>
           </w:p>
           <w:p>
             <w:pPr>
               <w:spacing w:after="120" w:line="276" w:lineRule="auto"/>
+              <w:jc w:val="left"/>
             </w:pPr>
             <w:r>
               <w:rPr>
                 <w:rFonts w:ascii="Times New Roman" w:hAnsi="Times New Roman"/>
-                <w:b/>
+                <w:b w:val="0"/>
                 <w:i w:val="0"/>
                 <w:sz w:val="24"/>
               </w:rPr>
@@ -1202,17 +1164,36 @@
                 <w:i w:val="0"/>
                 <w:sz w:val="24"/>
               </w:rPr>
-              <w:t>(2009). La motivación. El Cid Editor | apuntes.</w:t>
+              <w:t xml:space="preserve">(2009). </w:t>
+            </w:r>
+            <w:r>
+              <w:rPr>
+                <w:rFonts w:ascii="Times New Roman" w:hAnsi="Times New Roman"/>
+                <w:b w:val="0"/>
+                <w:i/>
+                <w:sz w:val="24"/>
+              </w:rPr>
+              <w:t xml:space="preserve">La motivación. </w:t>
+            </w:r>
+            <w:r>
+              <w:rPr>
+                <w:rFonts w:ascii="Times New Roman" w:hAnsi="Times New Roman"/>
+                <w:b w:val="0"/>
+                <w:i w:val="0"/>
+                <w:sz w:val="24"/>
+              </w:rPr>
+              <w:t>El Cid Editor | apuntes.</w:t>
             </w:r>
           </w:p>
           <w:p>
             <w:pPr>
               <w:spacing w:after="120" w:line="276" w:lineRule="auto"/>
+              <w:jc w:val="left"/>
             </w:pPr>
             <w:r>
               <w:rPr>
                 <w:rFonts w:ascii="Times New Roman" w:hAnsi="Times New Roman"/>
-                <w:b/>
+                <w:b w:val="0"/>
                 <w:i w:val="0"/>
                 <w:sz w:val="24"/>
               </w:rPr>
@@ -1225,17 +1206,36 @@
                 <w:i w:val="0"/>
                 <w:sz w:val="24"/>
               </w:rPr>
-              <w:t>(2017). Aprendizaje autónomo y competencias. Dominio de las Ciencias, 3(1), 241-253.</w:t>
+              <w:t xml:space="preserve">(2017). </w:t>
+            </w:r>
+            <w:r>
+              <w:rPr>
+                <w:rFonts w:ascii="Times New Roman" w:hAnsi="Times New Roman"/>
+                <w:b w:val="0"/>
+                <w:i/>
+                <w:sz w:val="24"/>
+              </w:rPr>
+              <w:t xml:space="preserve">Aprendizaje autónomo y competencias. </w:t>
+            </w:r>
+            <w:r>
+              <w:rPr>
+                <w:rFonts w:ascii="Times New Roman" w:hAnsi="Times New Roman"/>
+                <w:b w:val="0"/>
+                <w:i w:val="0"/>
+                <w:sz w:val="24"/>
+              </w:rPr>
+              <w:t>Dominio de las Ciencias, 3(1), 241-253.</w:t>
             </w:r>
           </w:p>
           <w:p>
             <w:pPr>
               <w:spacing w:after="120" w:line="276" w:lineRule="auto"/>
+              <w:jc w:val="left"/>
             </w:pPr>
             <w:r>
               <w:rPr>
                 <w:rFonts w:ascii="Times New Roman" w:hAnsi="Times New Roman"/>
-                <w:b/>
+                <w:b w:val="0"/>
                 <w:i w:val="0"/>
                 <w:sz w:val="24"/>
               </w:rPr>
@@ -1248,17 +1248,36 @@
                 <w:i w:val="0"/>
                 <w:sz w:val="24"/>
               </w:rPr>
-              <w:t>(2026). Módulo Didáctico Unidad 4: Motivación — Cátedra Institucional. Facultad de Ingeniería, Universidad de Cartagena.</w:t>
+              <w:t xml:space="preserve">(2026). </w:t>
+            </w:r>
+            <w:r>
+              <w:rPr>
+                <w:rFonts w:ascii="Times New Roman" w:hAnsi="Times New Roman"/>
+                <w:b w:val="0"/>
+                <w:i/>
+                <w:sz w:val="24"/>
+              </w:rPr>
+              <w:t xml:space="preserve">Módulo Didáctico Unidad 4: Motivación — Cátedra Institucional. </w:t>
+            </w:r>
+            <w:r>
+              <w:rPr>
+                <w:rFonts w:ascii="Times New Roman" w:hAnsi="Times New Roman"/>
+                <w:b w:val="0"/>
+                <w:i w:val="0"/>
+                <w:sz w:val="24"/>
+              </w:rPr>
+              <w:t>Facultad de Ingeniería, Universidad de Cartagena.</w:t>
             </w:r>
           </w:p>
           <w:p>
             <w:pPr>
               <w:spacing w:after="120" w:line="276" w:lineRule="auto"/>
+              <w:jc w:val="left"/>
             </w:pPr>
             <w:r>
               <w:rPr>
                 <w:rFonts w:ascii="Times New Roman" w:hAnsi="Times New Roman"/>
-                <w:b/>
+                <w:b w:val="0"/>
                 <w:i w:val="0"/>
                 <w:sz w:val="24"/>
               </w:rPr>
@@ -1271,7 +1290,25 @@
                 <w:i w:val="0"/>
                 <w:sz w:val="24"/>
               </w:rPr>
-              <w:t>(2015). APA dictionary of psychology (2.ª ed.). American Psychological Association.</w:t>
+              <w:t xml:space="preserve">(2015). </w:t>
+            </w:r>
+            <w:r>
+              <w:rPr>
+                <w:rFonts w:ascii="Times New Roman" w:hAnsi="Times New Roman"/>
+                <w:b w:val="0"/>
+                <w:i/>
+                <w:sz w:val="24"/>
+              </w:rPr>
+              <w:t xml:space="preserve">APA dictionary of psychology </w:t>
+            </w:r>
+            <w:r>
+              <w:rPr>
+                <w:rFonts w:ascii="Times New Roman" w:hAnsi="Times New Roman"/>
+                <w:b w:val="0"/>
+                <w:i w:val="0"/>
+                <w:sz w:val="24"/>
+              </w:rPr>
+              <w:t>(2.ª ed.). American Psychological Association.</w:t>
             </w:r>
           </w:p>
         </w:tc>

</xml_diff>

<commit_message>
fix(catedra): clean up methodology and remove extraneous APA text in Protocolo Individual 4
</commit_message>
<xml_diff>
--- a/Cátedra Institucional/Entregables/Protocolo Individual 4.docx
+++ b/Cátedra Institucional/Entregables/Protocolo Individual 4.docx
@@ -459,7 +459,7 @@
                 <w:i w:val="0"/>
                 <w:sz w:val="24"/>
               </w:rPr>
-              <w:t>Lectura y análisis del módulo de la Unidad 4 de Cátedra Institucional sobre Motivación y Valores (Motivación.pdf). La actividad se enfoca en entender qué nos mueve a actuar, revisando las diferencias que plantea la APA entre impulsos, instintos, necesidades y motivos. También estudié la pirámide de Abraham Maslow, la función de los valores éticos como satisfactores directos de nuestras necesidades y los cuatro valores que exige el estudio a distancia (autonomía, solidaridad, diálogo y tolerancia) para avanzar en la carrera de Ingeniería de Software.</w:t>
+              <w:t>Lectura y análisis del módulo de la Unidad 4 de Cátedra Institucional sobre Motivación y Valores (Motivación.pdf). La actividad se enfoca en entender qué nos mueve a actuar, revisando las diferencias entre impulsos, instintos, necesidades y motivos. También estudié la pirámide de Abraham Maslow, la función de los valores éticos como satisfactores directos de nuestras necesidades y los cuatro valores que exige el estudio a distancia (autonomía, solidaridad, diálogo y tolerancia) para avanzar en la carrera de Ingeniería de Software.</w:t>
             </w:r>
           </w:p>
         </w:tc>
@@ -502,7 +502,7 @@
                 <w:i w:val="0"/>
                 <w:sz w:val="24"/>
               </w:rPr>
-              <w:t>Pirámide de Maslow, Impulso vs motivo (APA, 2015), Tensión por privación, Satisfactores axiológicos, Autorrealización personal, Autonomía (autos y nomos), Solidaridad y diálogo a distancia.</w:t>
+              <w:t>Pirámide de Maslow, Impulso vs motivo, Tensión por privación, Satisfactores de valores, Autorrealización personal, Autonomía (autos y nomos), Solidaridad y diálogo a distancia.</w:t>
             </w:r>
           </w:p>
         </w:tc>
@@ -548,7 +548,7 @@
                 <w:i w:val="0"/>
                 <w:sz w:val="24"/>
               </w:rPr>
-              <w:t>1. Diferenciar qué es un impulso, un instinto, una necesidad y un motivo según la psicología moderna.</w:t>
+              <w:t>Diferenciar con claridad qué es un impulso, un instinto, una necesidad y un motivo sin confundir los términos.</w:t>
             </w:r>
           </w:p>
           <w:p>
@@ -563,7 +563,7 @@
                 <w:i w:val="0"/>
                 <w:sz w:val="24"/>
               </w:rPr>
-              <w:t>2. Entender los cinco niveles de la pirámide de Maslow y ver cómo influye el cuidado de las necesidades básicas en el rendimiento académico.</w:t>
+              <w:t>Entender los cinco niveles de la pirámide de Maslow y ver cómo influye el cuidado de las necesidades básicas en el rendimiento académico.</w:t>
             </w:r>
           </w:p>
           <w:p>
@@ -578,7 +578,7 @@
                 <w:i w:val="0"/>
                 <w:sz w:val="24"/>
               </w:rPr>
-              <w:t>3. Analizar cómo los valores éticos ayudan a resolver necesidades personales y sociales de forma constructiva.</w:t>
+              <w:t>Analizar cómo los valores éticos ayudan a resolver necesidades personales y sociales de forma constructiva.</w:t>
             </w:r>
           </w:p>
           <w:p>
@@ -593,7 +593,7 @@
                 <w:i w:val="0"/>
                 <w:sz w:val="24"/>
               </w:rPr>
-              <w:t>4. Reflexionar sobre el sentido práctico de la autonomía en la educación a distancia para evitar la postergación de tareas.</w:t>
+              <w:t>Reflexionar sobre el sentido práctico de la autonomía en la educación a distancia para evitar la postergación de tareas.</w:t>
             </w:r>
           </w:p>
         </w:tc>
@@ -833,7 +833,7 @@
                 <w:i w:val="0"/>
                 <w:sz w:val="24"/>
               </w:rPr>
-              <w:t>El documento inicia contrastando la conducta animal con la humana. Mientras los animales responden a pautas instintivas fijas, las personas contamos con razonamiento para plantearnos objetivos y elegir cómo lograrlos. El módulo se apoya en el diccionario de la APA para ordenar cuatro conceptos que solemos usar como sinónimos: el impulso surge de golpe y sin deliberación previa; el instinto es una carga biológica innata; la necesidad representa una privación que desestabiliza el organismo; y el motivo es la energía psicológica enfocada en un propósito concreto.</w:t>
+              <w:t>El documento inicia contrastando la conducta animal con la humana. Mientras los animales responden a pautas instintivas fijas, las personas contamos con razonamiento para plantearnos objetivos y elegir cómo lograrlos. El módulo ayuda a ordenar cuatro conceptos que solemos usar como sinónimos: el impulso surge de golpe y sin deliberación previa; el instinto es una carga biológica innata; la necesidad representa una privación que desestabiliza el organismo; y el motivo es la energía psicológica enfocada en un propósito concreto.</w:t>
             </w:r>
           </w:p>
           <w:p>
@@ -880,13 +880,13 @@
               </w:rPr>
               <w:t>Finalmente, el módulo aterriza estos principios en el modelo de educación superior a distancia. Señala que este sistema requiere estudiantes activos y destaca cuatro valores formativos:</w:t>
               <w:br/>
-              <w:t>• Autonomía: Darse horarios de estudio propios y asumir con madurez las decisiones académicas sin requerir supervisión ajena.</w:t>
+              <w:t>1. Autonomía: Darse horarios de estudio propios y asumir con madurez las decisiones académicas sin requerir supervisión ajena.</w:t>
               <w:br/>
-              <w:t>• Solidaridad: Apoyar a compañeros con limitaciones de tiempo o conectividad, buscando el progreso colectivo.</w:t>
+              <w:t>2. Solidaridad: Apoyar a compañeros con limitaciones de tiempo o conectividad, buscando el progreso colectivo.</w:t>
               <w:br/>
-              <w:t>• Diálogo: Mantener una comunicación fluida y sincera para contrarrestar el aislamiento propio del entorno virtual.</w:t>
+              <w:t>3. Diálogo: Mantener una comunicación fluida y sincera para contrarrestar el aislamiento propio del entorno virtual.</w:t>
               <w:br/>
-              <w:t>• Tolerancia: Comprender y valorar los distintos puntos de vista y ritmos de aprendizaje en el equipo.</w:t>
+              <w:t>4. Tolerancia: Comprender y valorar los distintos puntos de vista y ritmos de aprendizaje en el equipo.</w:t>
             </w:r>
           </w:p>
         </w:tc>
@@ -933,7 +933,7 @@
                 <w:i w:val="0"/>
                 <w:sz w:val="24"/>
               </w:rPr>
-              <w:t>Descargué el documento Motivación.pdf del campus virtual SIMA y tomé notas en Obsidian. Al revisar la jerarquía de Maslow, la comparé con mi propia rutina universitaria: noté con claridad cómo el cansancio y el desorden en los horarios de sueño me reducen la concentración al programar o al resolver problemas de cálculo. Luego resumí las definiciones de la APA y redacté este protocolo con mis reflexiones personales.</w:t>
+              <w:t>Entré a la plataforma SIMA, descargué el documento Motivación.pdf de la Unidad 4 y lo leí con calma tomando apuntes en Obsidian. Al revisar la jerarquía de Maslow, la comparé con mi propia rutina universitaria: noté con claridad cómo el cansancio y el desorden en los horarios de sueño me reducen la concentración al programar o al resolver problemas de cálculo. Para terminar de repasar, usé NotebookLM para hacerme preguntas de autoevaluación sobre el tema y confirmar que tenía claras las diferencias entre impulso, necesidad y motivo antes de redactar este protocolo.</w:t>
             </w:r>
           </w:p>
         </w:tc>
@@ -976,7 +976,7 @@
                 <w:i w:val="0"/>
                 <w:sz w:val="24"/>
               </w:rPr>
-              <w:t>• La motivación real se sostiene con disciplina diaria, metas específicas y hábitos estables, no con arranques emocionales pasajeros.</w:t>
+              <w:t>La motivación real se sostiene con disciplina diaria, metas específicas y hábitos estables, no con arranques emocionales pasajeros.</w:t>
             </w:r>
           </w:p>
           <w:p>
@@ -991,7 +991,7 @@
                 <w:i w:val="0"/>
                 <w:sz w:val="24"/>
               </w:rPr>
-              <w:t>• La pirámide de Maslow confirma que el descanso es una condición técnica para estudiar. Cuando descuido las horas de sueño, mi capacidad de razonamiento abstracto se cae por completo.</w:t>
+              <w:t>La pirámide de Maslow confirma que el descanso es una condición técnica para estudiar. Cuando descuido las horas de sueño, mi capacidad de razonamiento abstracto se cae por completo.</w:t>
             </w:r>
           </w:p>
           <w:p>
@@ -1006,7 +1006,7 @@
                 <w:i w:val="0"/>
                 <w:sz w:val="24"/>
               </w:rPr>
-              <w:t>• La autonomía es el eje de la educación a distancia. Nadie va a vigilar si leo o no los módulos; mi avance en la carrera depende exclusivamente de las normas que yo mismo decida cumplir.</w:t>
+              <w:t>La autonomía es el eje de la educación a distancia. Nadie va a vigilar si leo o no los módulos; mi avance en la carrera depende exclusivamente de las normas que yo mismo decida cumplir.</w:t>
             </w:r>
           </w:p>
         </w:tc>
@@ -1113,16 +1113,7 @@
                 <w:i w:val="0"/>
                 <w:sz w:val="24"/>
               </w:rPr>
-              <w:t xml:space="preserve">Interconsulting Bureau. </w:t>
-            </w:r>
-            <w:r>
-              <w:rPr>
-                <w:rFonts w:ascii="Times New Roman" w:hAnsi="Times New Roman"/>
-                <w:b w:val="0"/>
-                <w:i w:val="0"/>
-                <w:sz w:val="24"/>
-              </w:rPr>
-              <w:t xml:space="preserve">(2015). </w:t>
+              <w:t xml:space="preserve">Interconsulting Bureau. (2015). </w:t>
             </w:r>
             <w:r>
               <w:rPr>
@@ -1155,16 +1146,7 @@
                 <w:i w:val="0"/>
                 <w:sz w:val="24"/>
               </w:rPr>
-              <w:t xml:space="preserve">Mendoza, E. </w:t>
-            </w:r>
-            <w:r>
-              <w:rPr>
-                <w:rFonts w:ascii="Times New Roman" w:hAnsi="Times New Roman"/>
-                <w:b w:val="0"/>
-                <w:i w:val="0"/>
-                <w:sz w:val="24"/>
-              </w:rPr>
-              <w:t xml:space="preserve">(2009). </w:t>
+              <w:t xml:space="preserve">Mendoza, E. (2009). </w:t>
             </w:r>
             <w:r>
               <w:rPr>
@@ -1197,16 +1179,7 @@
                 <w:i w:val="0"/>
                 <w:sz w:val="24"/>
               </w:rPr>
-              <w:t xml:space="preserve">Mendoza, Y. D. S. </w:t>
-            </w:r>
-            <w:r>
-              <w:rPr>
-                <w:rFonts w:ascii="Times New Roman" w:hAnsi="Times New Roman"/>
-                <w:b w:val="0"/>
-                <w:i w:val="0"/>
-                <w:sz w:val="24"/>
-              </w:rPr>
-              <w:t xml:space="preserve">(2017). </w:t>
+              <w:t xml:space="preserve">Mendoza, Y. D. S. (2017). </w:t>
             </w:r>
             <w:r>
               <w:rPr>
@@ -1239,16 +1212,7 @@
                 <w:i w:val="0"/>
                 <w:sz w:val="24"/>
               </w:rPr>
-              <w:t xml:space="preserve">Universidad de Cartagena - CTEV. </w:t>
-            </w:r>
-            <w:r>
-              <w:rPr>
-                <w:rFonts w:ascii="Times New Roman" w:hAnsi="Times New Roman"/>
-                <w:b w:val="0"/>
-                <w:i w:val="0"/>
-                <w:sz w:val="24"/>
-              </w:rPr>
-              <w:t xml:space="preserve">(2026). </w:t>
+              <w:t xml:space="preserve">Universidad de Cartagena - CTEV. (2026). </w:t>
             </w:r>
             <w:r>
               <w:rPr>
@@ -1267,48 +1231,6 @@
                 <w:sz w:val="24"/>
               </w:rPr>
               <w:t>Facultad de Ingeniería, Universidad de Cartagena.</w:t>
-            </w:r>
-          </w:p>
-          <w:p>
-            <w:pPr>
-              <w:spacing w:after="120" w:line="276" w:lineRule="auto"/>
-              <w:jc w:val="left"/>
-            </w:pPr>
-            <w:r>
-              <w:rPr>
-                <w:rFonts w:ascii="Times New Roman" w:hAnsi="Times New Roman"/>
-                <w:b w:val="0"/>
-                <w:i w:val="0"/>
-                <w:sz w:val="24"/>
-              </w:rPr>
-              <w:t xml:space="preserve">VandenBos, G. R. (Ed.). </w:t>
-            </w:r>
-            <w:r>
-              <w:rPr>
-                <w:rFonts w:ascii="Times New Roman" w:hAnsi="Times New Roman"/>
-                <w:b w:val="0"/>
-                <w:i w:val="0"/>
-                <w:sz w:val="24"/>
-              </w:rPr>
-              <w:t xml:space="preserve">(2015). </w:t>
-            </w:r>
-            <w:r>
-              <w:rPr>
-                <w:rFonts w:ascii="Times New Roman" w:hAnsi="Times New Roman"/>
-                <w:b w:val="0"/>
-                <w:i/>
-                <w:sz w:val="24"/>
-              </w:rPr>
-              <w:t xml:space="preserve">APA dictionary of psychology </w:t>
-            </w:r>
-            <w:r>
-              <w:rPr>
-                <w:rFonts w:ascii="Times New Roman" w:hAnsi="Times New Roman"/>
-                <w:b w:val="0"/>
-                <w:i w:val="0"/>
-                <w:sz w:val="24"/>
-              </w:rPr>
-              <w:t>(2.ª ed.). American Psychological Association.</w:t>
             </w:r>
           </w:p>
         </w:tc>

</xml_diff>

<commit_message>
fix(catedra): eliminate embedded newlines in summary paragraph to fix word justification spacing
</commit_message>
<xml_diff>
--- a/Cátedra Institucional/Entregables/Protocolo Individual 4.docx
+++ b/Cátedra Institucional/Entregables/Protocolo Individual 4.docx
@@ -878,15 +878,7 @@
                 <w:i w:val="0"/>
                 <w:sz w:val="24"/>
               </w:rPr>
-              <w:t>Finalmente, el módulo aterriza estos principios en el modelo de educación superior a distancia. Señala que este sistema requiere estudiantes activos y destaca cuatro valores formativos:</w:t>
-              <w:br/>
-              <w:t>1. Autonomía: Darse horarios de estudio propios y asumir con madurez las decisiones académicas sin requerir supervisión ajena.</w:t>
-              <w:br/>
-              <w:t>2. Solidaridad: Apoyar a compañeros con limitaciones de tiempo o conectividad, buscando el progreso colectivo.</w:t>
-              <w:br/>
-              <w:t>3. Diálogo: Mantener una comunicación fluida y sincera para contrarrestar el aislamiento propio del entorno virtual.</w:t>
-              <w:br/>
-              <w:t>4. Tolerancia: Comprender y valorar los distintos puntos de vista y ritmos de aprendizaje en el equipo.</w:t>
+              <w:t>Finalmente, el módulo aterriza estos principios en la educación a distancia, señalando que esta modalidad requiere estudiantes activos y comprometidos. Destaca cuatro valores formativos: la autonomía para fijarse horarios y responder por el propio estudio sin requerir supervisión ajena; la solidaridad para apoyar a compañeros con limitaciones de tiempo o conectividad; el diálogo sincero para contrarrestar el aislamiento virtual; y la tolerancia para comprender y valorar los distintos puntos de vista y ritmos de aprendizaje en el equipo.</w:t>
             </w:r>
           </w:p>
         </w:tc>

</xml_diff>